<commit_message>
added daniels edits figures and comments back
</commit_message>
<xml_diff>
--- a/Docs/00_CanJFS/R1_18062026/00_R1_CanJFS_AllFigures.docx
+++ b/Docs/00_CanJFS/R1_18062026/00_R1_CanJFS_AllFigures.docx
@@ -68,7 +68,21 @@
         <w:rPr>
           <w:rFonts w:ascii="Garamond" w:hAnsi="Garamond"/>
         </w:rPr>
-        <w:t xml:space="preserve"> Strontium isoscape of the Kuskokwim River Basin (French et al., 2020) displaying the spatial variation in </w:t>
+        <w:t xml:space="preserve"> Strontium </w:t>
+      </w:r>
+      <w:proofErr w:type="spellStart"/>
+      <w:r>
+        <w:rPr>
+          <w:rFonts w:ascii="Garamond" w:hAnsi="Garamond"/>
+        </w:rPr>
+        <w:t>isoscape</w:t>
+      </w:r>
+      <w:proofErr w:type="spellEnd"/>
+      <w:r>
+        <w:rPr>
+          <w:rFonts w:ascii="Garamond" w:hAnsi="Garamond"/>
+        </w:rPr>
+        <w:t xml:space="preserve"> of the Kuskokwim River Basin (French et al., 2020) displaying the spatial variation in </w:t>
       </w:r>
       <w:r>
         <w:rPr>
@@ -259,12 +273,11 @@
                         <w:txbxContent>
                           <w:p>
                             <w:pPr>
-                              <w:pStyle w:val="ListParagraph"/>
-                              <w:numPr>
-                                <w:ilvl w:val="0"/>
-                                <w:numId w:val="1"/>
-                              </w:numPr>
+                              <w:ind w:left="360"/>
                             </w:pPr>
+                            <w:r>
+                              <w:t>B.</w:t>
+                            </w:r>
                           </w:p>
                         </w:txbxContent>
                       </wps:txbx>
@@ -298,12 +311,11 @@
                   <w:txbxContent>
                     <w:p>
                       <w:pPr>
-                        <w:pStyle w:val="ListParagraph"/>
-                        <w:numPr>
-                          <w:ilvl w:val="0"/>
-                          <w:numId w:val="1"/>
-                        </w:numPr>
+                        <w:ind w:left="360"/>
                       </w:pPr>
+                      <w:r>
+                        <w:t>B.</w:t>
+                      </w:r>
                     </w:p>
                   </w:txbxContent>
                 </v:textbox>
@@ -358,12 +370,11 @@
                         <w:txbxContent>
                           <w:p>
                             <w:pPr>
-                              <w:pStyle w:val="ListParagraph"/>
-                              <w:numPr>
-                                <w:ilvl w:val="0"/>
-                                <w:numId w:val="1"/>
-                              </w:numPr>
+                              <w:ind w:left="360"/>
                             </w:pPr>
+                            <w:r>
+                              <w:t>A.</w:t>
+                            </w:r>
                           </w:p>
                         </w:txbxContent>
                       </wps:txbx>
@@ -393,12 +404,11 @@
                   <w:txbxContent>
                     <w:p>
                       <w:pPr>
-                        <w:pStyle w:val="ListParagraph"/>
-                        <w:numPr>
-                          <w:ilvl w:val="0"/>
-                          <w:numId w:val="1"/>
-                        </w:numPr>
+                        <w:ind w:left="360"/>
                       </w:pPr>
+                      <w:r>
+                        <w:t>A.</w:t>
+                      </w:r>
                     </w:p>
                   </w:txbxContent>
                 </v:textbox>
@@ -559,9 +569,9 @@
         </w:rPr>
         <w:lastRenderedPageBreak/>
         <w:drawing>
-          <wp:inline distT="0" distB="0" distL="0" distR="0" wp14:anchorId="4B5CAF4E" wp14:editId="627B175E">
-            <wp:extent cx="6148441" cy="2246546"/>
-            <wp:effectExtent l="0" t="0" r="5080" b="1905"/>
+          <wp:inline distT="0" distB="0" distL="0" distR="0" wp14:anchorId="4B5CAF4E" wp14:editId="6E62F7C4">
+            <wp:extent cx="6272064" cy="2291715"/>
+            <wp:effectExtent l="0" t="0" r="0" b="0"/>
             <wp:docPr id="1062445846" name="Picture 7"/>
             <wp:cNvGraphicFramePr>
               <a:graphicFrameLocks xmlns:a="http://schemas.openxmlformats.org/drawingml/2006/main" noChangeAspect="1"/>
@@ -588,7 +598,7 @@
                   <pic:spPr>
                     <a:xfrm>
                       <a:off x="0" y="0"/>
-                      <a:ext cx="6196484" cy="2264100"/>
+                      <a:ext cx="6281319" cy="2295097"/>
                     </a:xfrm>
                     <a:prstGeom prst="rect">
                       <a:avLst/>
@@ -828,8 +838,8 @@
         </w:rPr>
         <w:lastRenderedPageBreak/>
         <w:drawing>
-          <wp:inline distT="0" distB="0" distL="0" distR="0" wp14:anchorId="38EAD5C6" wp14:editId="4AA53312">
-            <wp:extent cx="3144659" cy="6738557"/>
+          <wp:inline distT="0" distB="0" distL="0" distR="0" wp14:anchorId="38EAD5C6" wp14:editId="7B04489F">
+            <wp:extent cx="3144659" cy="6738555"/>
             <wp:effectExtent l="0" t="0" r="0" b="5715"/>
             <wp:docPr id="1304865973" name="Picture 3"/>
             <wp:cNvGraphicFramePr>
@@ -857,7 +867,7 @@
                   <pic:spPr>
                     <a:xfrm>
                       <a:off x="0" y="0"/>
-                      <a:ext cx="3144659" cy="6738557"/>
+                      <a:ext cx="3144659" cy="6738555"/>
                     </a:xfrm>
                     <a:prstGeom prst="rect">
                       <a:avLst/>
@@ -913,9 +923,9 @@
           <w:noProof/>
         </w:rPr>
         <w:drawing>
-          <wp:inline distT="0" distB="0" distL="0" distR="0" wp14:anchorId="65D096B0" wp14:editId="5660623A">
-            <wp:extent cx="5943236" cy="3782060"/>
-            <wp:effectExtent l="0" t="0" r="635" b="8890"/>
+          <wp:inline distT="0" distB="0" distL="0" distR="0" wp14:anchorId="65D096B0" wp14:editId="43C86CD7">
+            <wp:extent cx="5943236" cy="3782059"/>
+            <wp:effectExtent l="0" t="0" r="635" b="9525"/>
             <wp:docPr id="1793165430" name="Picture 8"/>
             <wp:cNvGraphicFramePr>
               <a:graphicFrameLocks xmlns:a="http://schemas.openxmlformats.org/drawingml/2006/main" noChangeAspect="1"/>
@@ -942,7 +952,7 @@
                   <pic:spPr>
                     <a:xfrm>
                       <a:off x="0" y="0"/>
-                      <a:ext cx="5943236" cy="3782060"/>
+                      <a:ext cx="5943236" cy="3782059"/>
                     </a:xfrm>
                     <a:prstGeom prst="rect">
                       <a:avLst/>
@@ -977,7 +987,6 @@
         </w:rPr>
         <w:t>5</w:t>
       </w:r>
-      <w:proofErr w:type="gramStart"/>
       <w:r>
         <w:rPr>
           <w:rFonts w:ascii="Garamond" w:hAnsi="Garamond"/>
@@ -990,14 +999,7 @@
         <w:rPr>
           <w:rFonts w:ascii="Garamond" w:hAnsi="Garamond"/>
         </w:rPr>
-        <w:t xml:space="preserve">  The</w:t>
-      </w:r>
-      <w:proofErr w:type="gramEnd"/>
-      <w:r>
-        <w:rPr>
-          <w:rFonts w:ascii="Garamond" w:hAnsi="Garamond"/>
-        </w:rPr>
-        <w:t xml:space="preserve"> proportion of each regional group’s total return protected under several simulated front-end closure scenarios, including the current closure. X-axis labels show the number of days the simulated closure end date differs from the current end date (−3 = June 8, 0 = June 11, +3 = June 14, +6 = June 17). Each point represents a single year, colored bars show the year-to-year range, and black lines denote the </w:t>
+        <w:t xml:space="preserve"> The proportion of each regional group’s total return protected under several simulated front-end closure scenarios, including the current closure. X-axis labels show the number of days the simulated closure end date differs from the current end date (−3 = June 8, 0 = June 11, +3 = June 14, +6 = June 17). Each point represents a single year, colored bars show the year-to-year range, and black lines denote the </w:t>
       </w:r>
       <w:proofErr w:type="gramStart"/>
       <w:r>
@@ -1033,8 +1035,8 @@
         </w:rPr>
         <w:lastRenderedPageBreak/>
         <w:drawing>
-          <wp:inline distT="0" distB="0" distL="0" distR="0" wp14:anchorId="600DFCB8" wp14:editId="4A8473EF">
-            <wp:extent cx="4807543" cy="4807543"/>
+          <wp:inline distT="0" distB="0" distL="0" distR="0" wp14:anchorId="600DFCB8" wp14:editId="54A47279">
+            <wp:extent cx="5623560" cy="5623560"/>
             <wp:effectExtent l="0" t="0" r="0" b="0"/>
             <wp:docPr id="1512324811" name="Picture 6"/>
             <wp:cNvGraphicFramePr>
@@ -1062,7 +1064,7 @@
                   <pic:spPr>
                     <a:xfrm>
                       <a:off x="0" y="0"/>
-                      <a:ext cx="4807543" cy="4807543"/>
+                      <a:ext cx="5624254" cy="5624254"/>
                     </a:xfrm>
                     <a:prstGeom prst="rect">
                       <a:avLst/>
@@ -2128,6 +2130,72 @@
       <w:spacing w:val="5"/>
     </w:rPr>
   </w:style>
+  <w:style w:type="character" w:styleId="CommentReference">
+    <w:name w:val="annotation reference"/>
+    <w:basedOn w:val="DefaultParagraphFont"/>
+    <w:uiPriority w:val="99"/>
+    <w:semiHidden/>
+    <w:unhideWhenUsed/>
+    <w:rsid w:val="00040C41"/>
+    <w:rPr>
+      <w:sz w:val="16"/>
+      <w:szCs w:val="16"/>
+    </w:rPr>
+  </w:style>
+  <w:style w:type="paragraph" w:styleId="CommentText">
+    <w:name w:val="annotation text"/>
+    <w:basedOn w:val="Normal"/>
+    <w:link w:val="CommentTextChar"/>
+    <w:uiPriority w:val="99"/>
+    <w:unhideWhenUsed/>
+    <w:rsid w:val="00040C41"/>
+    <w:pPr>
+      <w:spacing w:line="240" w:lineRule="auto"/>
+    </w:pPr>
+    <w:rPr>
+      <w:sz w:val="20"/>
+      <w:szCs w:val="20"/>
+    </w:rPr>
+  </w:style>
+  <w:style w:type="character" w:customStyle="1" w:styleId="CommentTextChar">
+    <w:name w:val="Comment Text Char"/>
+    <w:basedOn w:val="DefaultParagraphFont"/>
+    <w:link w:val="CommentText"/>
+    <w:uiPriority w:val="99"/>
+    <w:rsid w:val="00040C41"/>
+    <w:rPr>
+      <w:sz w:val="20"/>
+      <w:szCs w:val="20"/>
+    </w:rPr>
+  </w:style>
+  <w:style w:type="paragraph" w:styleId="CommentSubject">
+    <w:name w:val="annotation subject"/>
+    <w:basedOn w:val="CommentText"/>
+    <w:next w:val="CommentText"/>
+    <w:link w:val="CommentSubjectChar"/>
+    <w:uiPriority w:val="99"/>
+    <w:semiHidden/>
+    <w:unhideWhenUsed/>
+    <w:rsid w:val="00040C41"/>
+    <w:rPr>
+      <w:b/>
+      <w:bCs/>
+    </w:rPr>
+  </w:style>
+  <w:style w:type="character" w:customStyle="1" w:styleId="CommentSubjectChar">
+    <w:name w:val="Comment Subject Char"/>
+    <w:basedOn w:val="CommentTextChar"/>
+    <w:link w:val="CommentSubject"/>
+    <w:uiPriority w:val="99"/>
+    <w:semiHidden/>
+    <w:rsid w:val="00040C41"/>
+    <w:rPr>
+      <w:b/>
+      <w:bCs/>
+      <w:sz w:val="20"/>
+      <w:szCs w:val="20"/>
+    </w:rPr>
+  </w:style>
 </w:styles>
 </file>
 

</xml_diff>